<commit_message>
feat: render a report section for the five new inspection types
The template gains a CGB, RISER, CAISSON, SEABED and PIPELINE block, and
the gatherer fills their rows. RISER and CAISSON split over two tables so
no row carries thirteen columns; the child lists flatten into one cell
each. Regenerated with spike/create-template.ts.
</commit_message>
<xml_diff>
--- a/src/features/reports/default-template.docx
+++ b/src/features/reports/default-template.docx
@@ -2400,6 +2400,1347 @@
     <w:p>
       <w:r>
         <w:t xml:space="preserve">{/isBSI}</w:t>
+      </w:r>
+    </w:p>
+    <w:p>
+      <w:r>
+        <w:t xml:space="preserve">{#isCGB}</w:t>
+      </w:r>
+    </w:p>
+    <w:p>
+      <w:r>
+        <w:rPr>
+          <w:b/>
+          <w:sz w:val="26"/>
+          <w:szCs w:val="26"/>
+        </w:rPr>
+        <w:t xml:space="preserve">CGB Results</w:t>
+      </w:r>
+    </w:p>
+    <w:tbl>
+      <w:tblPr>
+        <w:tblW w:w="9638" w:type="dxa"/>
+        <w:tblBorders>
+          <w:top w:val="single" w:sz="4" w:space="0" w:color="808080"/>
+          <w:left w:val="single" w:sz="4" w:space="0" w:color="808080"/>
+          <w:bottom w:val="single" w:sz="4" w:space="0" w:color="808080"/>
+          <w:right w:val="single" w:sz="4" w:space="0" w:color="808080"/>
+          <w:insideH w:val="single" w:sz="4" w:space="0" w:color="808080"/>
+          <w:insideV w:val="single" w:sz="4" w:space="0" w:color="808080"/>
+        </w:tblBorders>
+        <w:tblLayout w:type="fixed"/>
+      </w:tblPr>
+      <w:tblGrid>
+        <w:gridCol w:w="1606"/>
+        <w:gridCol w:w="1606"/>
+        <w:gridCol w:w="1606"/>
+        <w:gridCol w:w="1606"/>
+        <w:gridCol w:w="1606"/>
+        <w:gridCol w:w="1606"/>
+      </w:tblGrid>
+      <w:tr>
+        <w:trPr>
+          <w:tblHeader/>
+        </w:trPr>
+        <w:tc>
+          <w:tcPr>
+            <w:tcW w:w="1606" w:type="dxa"/>
+          </w:tcPr>
+          <w:p>
+            <w:r>
+              <w:rPr>
+                <w:b/>
+              </w:rPr>
+              <w:t xml:space="preserve">Movement</w:t>
+            </w:r>
+          </w:p>
+        </w:tc>
+        <w:tc>
+          <w:tcPr>
+            <w:tcW w:w="1606" w:type="dxa"/>
+          </w:tcPr>
+          <w:p>
+            <w:r>
+              <w:rPr>
+                <w:b/>
+              </w:rPr>
+              <w:t xml:space="preserve">Movement Remark</w:t>
+            </w:r>
+          </w:p>
+        </w:tc>
+        <w:tc>
+          <w:tcPr>
+            <w:tcW w:w="1606" w:type="dxa"/>
+          </w:tcPr>
+          <w:p>
+            <w:r>
+              <w:rPr>
+                <w:b/>
+              </w:rPr>
+              <w:t xml:space="preserve">Debris</w:t>
+            </w:r>
+          </w:p>
+        </w:tc>
+        <w:tc>
+          <w:tcPr>
+            <w:tcW w:w="1606" w:type="dxa"/>
+          </w:tcPr>
+          <w:p>
+            <w:r>
+              <w:rPr>
+                <w:b/>
+              </w:rPr>
+              <w:t xml:space="preserve">Debris Type</w:t>
+            </w:r>
+          </w:p>
+        </w:tc>
+        <w:tc>
+          <w:tcPr>
+            <w:tcW w:w="1606" w:type="dxa"/>
+          </w:tcPr>
+          <w:p>
+            <w:r>
+              <w:rPr>
+                <w:b/>
+              </w:rPr>
+              <w:t xml:space="preserve">Remarks</w:t>
+            </w:r>
+          </w:p>
+        </w:tc>
+        <w:tc>
+          <w:tcPr>
+            <w:tcW w:w="1606" w:type="dxa"/>
+          </w:tcPr>
+          <w:p>
+            <w:r>
+              <w:rPr>
+                <w:b/>
+              </w:rPr>
+              <w:t xml:space="preserve">Recorded</w:t>
+            </w:r>
+          </w:p>
+        </w:tc>
+      </w:tr>
+      <w:tr>
+        <w:tc>
+          <w:tcPr>
+            <w:tcW w:w="1606" w:type="dxa"/>
+          </w:tcPr>
+          <w:p>
+            <w:r>
+              <w:t xml:space="preserve">{#rows}{movement}</w:t>
+            </w:r>
+          </w:p>
+        </w:tc>
+        <w:tc>
+          <w:tcPr>
+            <w:tcW w:w="1606" w:type="dxa"/>
+          </w:tcPr>
+          <w:p>
+            <w:r>
+              <w:t xml:space="preserve">{movement_remark}</w:t>
+            </w:r>
+          </w:p>
+        </w:tc>
+        <w:tc>
+          <w:tcPr>
+            <w:tcW w:w="1606" w:type="dxa"/>
+          </w:tcPr>
+          <w:p>
+            <w:r>
+              <w:t xml:space="preserve">{debris}</w:t>
+            </w:r>
+          </w:p>
+        </w:tc>
+        <w:tc>
+          <w:tcPr>
+            <w:tcW w:w="1606" w:type="dxa"/>
+          </w:tcPr>
+          <w:p>
+            <w:r>
+              <w:t xml:space="preserve">{debris_type}</w:t>
+            </w:r>
+          </w:p>
+        </w:tc>
+        <w:tc>
+          <w:tcPr>
+            <w:tcW w:w="1606" w:type="dxa"/>
+          </w:tcPr>
+          <w:p>
+            <w:r>
+              <w:t xml:space="preserve">{remarks}</w:t>
+            </w:r>
+          </w:p>
+        </w:tc>
+        <w:tc>
+          <w:tcPr>
+            <w:tcW w:w="1606" w:type="dxa"/>
+          </w:tcPr>
+          <w:p>
+            <w:r>
+              <w:t xml:space="preserve">{recorded}{/rows}</w:t>
+            </w:r>
+          </w:p>
+        </w:tc>
+      </w:tr>
+    </w:tbl>
+    <w:p>
+      <w:r>
+        <w:t xml:space="preserve">{/isCGB}</w:t>
+      </w:r>
+    </w:p>
+    <w:p>
+      <w:r>
+        <w:t xml:space="preserve">{#isRISER}</w:t>
+      </w:r>
+    </w:p>
+    <w:p>
+      <w:r>
+        <w:rPr>
+          <w:b/>
+          <w:sz w:val="26"/>
+          <w:szCs w:val="26"/>
+        </w:rPr>
+        <w:t xml:space="preserve">RISER Results</w:t>
+      </w:r>
+    </w:p>
+    <w:tbl>
+      <w:tblPr>
+        <w:tblW w:w="9638" w:type="dxa"/>
+        <w:tblBorders>
+          <w:top w:val="single" w:sz="4" w:space="0" w:color="808080"/>
+          <w:left w:val="single" w:sz="4" w:space="0" w:color="808080"/>
+          <w:bottom w:val="single" w:sz="4" w:space="0" w:color="808080"/>
+          <w:right w:val="single" w:sz="4" w:space="0" w:color="808080"/>
+          <w:insideH w:val="single" w:sz="4" w:space="0" w:color="808080"/>
+          <w:insideV w:val="single" w:sz="4" w:space="0" w:color="808080"/>
+        </w:tblBorders>
+        <w:tblLayout w:type="fixed"/>
+      </w:tblPr>
+      <w:tblGrid>
+        <w:gridCol w:w="1927"/>
+        <w:gridCol w:w="1927"/>
+        <w:gridCol w:w="1927"/>
+        <w:gridCol w:w="1927"/>
+        <w:gridCol w:w="1927"/>
+      </w:tblGrid>
+      <w:tr>
+        <w:trPr>
+          <w:tblHeader/>
+        </w:trPr>
+        <w:tc>
+          <w:tcPr>
+            <w:tcW w:w="1927" w:type="dxa"/>
+          </w:tcPr>
+          <w:p>
+            <w:r>
+              <w:rPr>
+                <w:b/>
+              </w:rPr>
+              <w:t xml:space="preserve">Touchdown Distance</w:t>
+            </w:r>
+          </w:p>
+        </w:tc>
+        <w:tc>
+          <w:tcPr>
+            <w:tcW w:w="1927" w:type="dxa"/>
+          </w:tcPr>
+          <w:p>
+            <w:r>
+              <w:rPr>
+                <w:b/>
+              </w:rPr>
+              <w:t xml:space="preserve">Bend to Mudbrace</w:t>
+            </w:r>
+          </w:p>
+        </w:tc>
+        <w:tc>
+          <w:tcPr>
+            <w:tcW w:w="1927" w:type="dxa"/>
+          </w:tcPr>
+          <w:p>
+            <w:r>
+              <w:rPr>
+                <w:b/>
+              </w:rPr>
+              <w:t xml:space="preserve">Bend Height</w:t>
+            </w:r>
+          </w:p>
+        </w:tc>
+        <w:tc>
+          <w:tcPr>
+            <w:tcW w:w="1927" w:type="dxa"/>
+          </w:tcPr>
+          <w:p>
+            <w:r>
+              <w:rPr>
+                <w:b/>
+              </w:rPr>
+              <w:t xml:space="preserve">Coating Status</w:t>
+            </w:r>
+          </w:p>
+        </w:tc>
+        <w:tc>
+          <w:tcPr>
+            <w:tcW w:w="1927" w:type="dxa"/>
+          </w:tcPr>
+          <w:p>
+            <w:r>
+              <w:rPr>
+                <w:b/>
+              </w:rPr>
+              <w:t xml:space="preserve">Coating Condition</w:t>
+            </w:r>
+          </w:p>
+        </w:tc>
+      </w:tr>
+      <w:tr>
+        <w:tc>
+          <w:tcPr>
+            <w:tcW w:w="1927" w:type="dxa"/>
+          </w:tcPr>
+          <w:p>
+            <w:r>
+              <w:t xml:space="preserve">{#rows}{touchdown_distance}</w:t>
+            </w:r>
+          </w:p>
+        </w:tc>
+        <w:tc>
+          <w:tcPr>
+            <w:tcW w:w="1927" w:type="dxa"/>
+          </w:tcPr>
+          <w:p>
+            <w:r>
+              <w:t xml:space="preserve">{mudbrace_distance}</w:t>
+            </w:r>
+          </w:p>
+        </w:tc>
+        <w:tc>
+          <w:tcPr>
+            <w:tcW w:w="1927" w:type="dxa"/>
+          </w:tcPr>
+          <w:p>
+            <w:r>
+              <w:t xml:space="preserve">{bend_height}</w:t>
+            </w:r>
+          </w:p>
+        </w:tc>
+        <w:tc>
+          <w:tcPr>
+            <w:tcW w:w="1927" w:type="dxa"/>
+          </w:tcPr>
+          <w:p>
+            <w:r>
+              <w:t xml:space="preserve">{coating_status}</w:t>
+            </w:r>
+          </w:p>
+        </w:tc>
+        <w:tc>
+          <w:tcPr>
+            <w:tcW w:w="1927" w:type="dxa"/>
+          </w:tcPr>
+          <w:p>
+            <w:r>
+              <w:t xml:space="preserve">{coating_condition}{/rows}</w:t>
+            </w:r>
+          </w:p>
+        </w:tc>
+      </w:tr>
+    </w:tbl>
+    <w:tbl>
+      <w:tblPr>
+        <w:tblW w:w="9638" w:type="dxa"/>
+        <w:tblBorders>
+          <w:top w:val="single" w:sz="4" w:space="0" w:color="808080"/>
+          <w:left w:val="single" w:sz="4" w:space="0" w:color="808080"/>
+          <w:bottom w:val="single" w:sz="4" w:space="0" w:color="808080"/>
+          <w:right w:val="single" w:sz="4" w:space="0" w:color="808080"/>
+          <w:insideH w:val="single" w:sz="4" w:space="0" w:color="808080"/>
+          <w:insideV w:val="single" w:sz="4" w:space="0" w:color="808080"/>
+        </w:tblBorders>
+        <w:tblLayout w:type="fixed"/>
+      </w:tblPr>
+      <w:tblGrid>
+        <w:gridCol w:w="1204"/>
+        <w:gridCol w:w="1204"/>
+        <w:gridCol w:w="1204"/>
+        <w:gridCol w:w="1204"/>
+        <w:gridCol w:w="1204"/>
+        <w:gridCol w:w="1204"/>
+        <w:gridCol w:w="1204"/>
+        <w:gridCol w:w="1204"/>
+      </w:tblGrid>
+      <w:tr>
+        <w:trPr>
+          <w:tblHeader/>
+        </w:trPr>
+        <w:tc>
+          <w:tcPr>
+            <w:tcW w:w="1204" w:type="dxa"/>
+          </w:tcPr>
+          <w:p>
+            <w:r>
+              <w:rPr>
+                <w:b/>
+              </w:rPr>
+              <w:t xml:space="preserve">Knee Brace</w:t>
+            </w:r>
+          </w:p>
+        </w:tc>
+        <w:tc>
+          <w:tcPr>
+            <w:tcW w:w="1204" w:type="dxa"/>
+          </w:tcPr>
+          <w:p>
+            <w:r>
+              <w:rPr>
+                <w:b/>
+              </w:rPr>
+              <w:t xml:space="preserve">Debris</w:t>
+            </w:r>
+          </w:p>
+        </w:tc>
+        <w:tc>
+          <w:tcPr>
+            <w:tcW w:w="1204" w:type="dxa"/>
+          </w:tcPr>
+          <w:p>
+            <w:r>
+              <w:rPr>
+                <w:b/>
+              </w:rPr>
+              <w:t xml:space="preserve">Debris Type</w:t>
+            </w:r>
+          </w:p>
+        </w:tc>
+        <w:tc>
+          <w:tcPr>
+            <w:tcW w:w="1204" w:type="dxa"/>
+          </w:tcPr>
+          <w:p>
+            <w:r>
+              <w:rPr>
+                <w:b/>
+              </w:rPr>
+              <w:t xml:space="preserve">Anomaly</w:t>
+            </w:r>
+          </w:p>
+        </w:tc>
+        <w:tc>
+          <w:tcPr>
+            <w:tcW w:w="1204" w:type="dxa"/>
+          </w:tcPr>
+          <w:p>
+            <w:r>
+              <w:rPr>
+                <w:b/>
+              </w:rPr>
+              <w:t xml:space="preserve">Recommendation</w:t>
+            </w:r>
+          </w:p>
+        </w:tc>
+        <w:tc>
+          <w:tcPr>
+            <w:tcW w:w="1204" w:type="dxa"/>
+          </w:tcPr>
+          <w:p>
+            <w:r>
+              <w:rPr>
+                <w:b/>
+              </w:rPr>
+              <w:t xml:space="preserve">Restricted Access</w:t>
+            </w:r>
+          </w:p>
+        </w:tc>
+        <w:tc>
+          <w:tcPr>
+            <w:tcW w:w="1204" w:type="dxa"/>
+          </w:tcPr>
+          <w:p>
+            <w:r>
+              <w:rPr>
+                <w:b/>
+              </w:rPr>
+              <w:t xml:space="preserve">Remarks</w:t>
+            </w:r>
+          </w:p>
+        </w:tc>
+        <w:tc>
+          <w:tcPr>
+            <w:tcW w:w="1204" w:type="dxa"/>
+          </w:tcPr>
+          <w:p>
+            <w:r>
+              <w:rPr>
+                <w:b/>
+              </w:rPr>
+              <w:t xml:space="preserve">Recorded</w:t>
+            </w:r>
+          </w:p>
+        </w:tc>
+      </w:tr>
+      <w:tr>
+        <w:tc>
+          <w:tcPr>
+            <w:tcW w:w="1204" w:type="dxa"/>
+          </w:tcPr>
+          <w:p>
+            <w:r>
+              <w:t xml:space="preserve">{#rows}{knee_brace}</w:t>
+            </w:r>
+          </w:p>
+        </w:tc>
+        <w:tc>
+          <w:tcPr>
+            <w:tcW w:w="1204" w:type="dxa"/>
+          </w:tcPr>
+          <w:p>
+            <w:r>
+              <w:t xml:space="preserve">{debris}</w:t>
+            </w:r>
+          </w:p>
+        </w:tc>
+        <w:tc>
+          <w:tcPr>
+            <w:tcW w:w="1204" w:type="dxa"/>
+          </w:tcPr>
+          <w:p>
+            <w:r>
+              <w:t xml:space="preserve">{debris_type}</w:t>
+            </w:r>
+          </w:p>
+        </w:tc>
+        <w:tc>
+          <w:tcPr>
+            <w:tcW w:w="1204" w:type="dxa"/>
+          </w:tcPr>
+          <w:p>
+            <w:r>
+              <w:t xml:space="preserve">{anomaly}</w:t>
+            </w:r>
+          </w:p>
+        </w:tc>
+        <w:tc>
+          <w:tcPr>
+            <w:tcW w:w="1204" w:type="dxa"/>
+          </w:tcPr>
+          <w:p>
+            <w:r>
+              <w:t xml:space="preserve">{recommendation}</w:t>
+            </w:r>
+          </w:p>
+        </w:tc>
+        <w:tc>
+          <w:tcPr>
+            <w:tcW w:w="1204" w:type="dxa"/>
+          </w:tcPr>
+          <w:p>
+            <w:r>
+              <w:t xml:space="preserve">{restricted_access}</w:t>
+            </w:r>
+          </w:p>
+        </w:tc>
+        <w:tc>
+          <w:tcPr>
+            <w:tcW w:w="1204" w:type="dxa"/>
+          </w:tcPr>
+          <w:p>
+            <w:r>
+              <w:t xml:space="preserve">{remarks}</w:t>
+            </w:r>
+          </w:p>
+        </w:tc>
+        <w:tc>
+          <w:tcPr>
+            <w:tcW w:w="1204" w:type="dxa"/>
+          </w:tcPr>
+          <w:p>
+            <w:r>
+              <w:t xml:space="preserve">{recorded}{/rows}</w:t>
+            </w:r>
+          </w:p>
+        </w:tc>
+      </w:tr>
+    </w:tbl>
+    <w:p>
+      <w:r>
+        <w:t xml:space="preserve">{/isRISER}</w:t>
+      </w:r>
+    </w:p>
+    <w:p>
+      <w:r>
+        <w:t xml:space="preserve">{#isCAISSON}</w:t>
+      </w:r>
+    </w:p>
+    <w:p>
+      <w:r>
+        <w:rPr>
+          <w:b/>
+          <w:sz w:val="26"/>
+          <w:szCs w:val="26"/>
+        </w:rPr>
+        <w:t xml:space="preserve">CAISSON Results</w:t>
+      </w:r>
+    </w:p>
+    <w:tbl>
+      <w:tblPr>
+        <w:tblW w:w="9638" w:type="dxa"/>
+        <w:tblBorders>
+          <w:top w:val="single" w:sz="4" w:space="0" w:color="808080"/>
+          <w:left w:val="single" w:sz="4" w:space="0" w:color="808080"/>
+          <w:bottom w:val="single" w:sz="4" w:space="0" w:color="808080"/>
+          <w:right w:val="single" w:sz="4" w:space="0" w:color="808080"/>
+          <w:insideH w:val="single" w:sz="4" w:space="0" w:color="808080"/>
+          <w:insideV w:val="single" w:sz="4" w:space="0" w:color="808080"/>
+        </w:tblBorders>
+        <w:tblLayout w:type="fixed"/>
+      </w:tblPr>
+      <w:tblGrid>
+        <w:gridCol w:w="1376"/>
+        <w:gridCol w:w="1376"/>
+        <w:gridCol w:w="1376"/>
+        <w:gridCol w:w="1376"/>
+        <w:gridCol w:w="1376"/>
+        <w:gridCol w:w="1376"/>
+        <w:gridCol w:w="1376"/>
+      </w:tblGrid>
+      <w:tr>
+        <w:trPr>
+          <w:tblHeader/>
+        </w:trPr>
+        <w:tc>
+          <w:tcPr>
+            <w:tcW w:w="1376" w:type="dxa"/>
+          </w:tcPr>
+          <w:p>
+            <w:r>
+              <w:rPr>
+                <w:b/>
+              </w:rPr>
+              <w:t xml:space="preserve">Visual Damage</w:t>
+            </w:r>
+          </w:p>
+        </w:tc>
+        <w:tc>
+          <w:tcPr>
+            <w:tcW w:w="1376" w:type="dxa"/>
+          </w:tcPr>
+          <w:p>
+            <w:r>
+              <w:rPr>
+                <w:b/>
+              </w:rPr>
+              <w:t xml:space="preserve">Visual Note</w:t>
+            </w:r>
+          </w:p>
+        </w:tc>
+        <w:tc>
+          <w:tcPr>
+            <w:tcW w:w="1376" w:type="dxa"/>
+          </w:tcPr>
+          <w:p>
+            <w:r>
+              <w:rPr>
+                <w:b/>
+              </w:rPr>
+              <w:t xml:space="preserve">Debris Present</w:t>
+            </w:r>
+          </w:p>
+        </w:tc>
+        <w:tc>
+          <w:tcPr>
+            <w:tcW w:w="1376" w:type="dxa"/>
+          </w:tcPr>
+          <w:p>
+            <w:r>
+              <w:rPr>
+                <w:b/>
+              </w:rPr>
+              <w:t xml:space="preserve">Debris Note</w:t>
+            </w:r>
+          </w:p>
+        </w:tc>
+        <w:tc>
+          <w:tcPr>
+            <w:tcW w:w="1376" w:type="dxa"/>
+          </w:tcPr>
+          <w:p>
+            <w:r>
+              <w:rPr>
+                <w:b/>
+              </w:rPr>
+              <w:t xml:space="preserve">Grating Present</w:t>
+            </w:r>
+          </w:p>
+        </w:tc>
+        <w:tc>
+          <w:tcPr>
+            <w:tcW w:w="1376" w:type="dxa"/>
+          </w:tcPr>
+          <w:p>
+            <w:r>
+              <w:rPr>
+                <w:b/>
+              </w:rPr>
+              <w:t xml:space="preserve">Blockage</w:t>
+            </w:r>
+          </w:p>
+        </w:tc>
+        <w:tc>
+          <w:tcPr>
+            <w:tcW w:w="1376" w:type="dxa"/>
+          </w:tcPr>
+          <w:p>
+            <w:r>
+              <w:rPr>
+                <w:b/>
+              </w:rPr>
+              <w:t xml:space="preserve">Grating Note</w:t>
+            </w:r>
+          </w:p>
+        </w:tc>
+      </w:tr>
+      <w:tr>
+        <w:tc>
+          <w:tcPr>
+            <w:tcW w:w="1376" w:type="dxa"/>
+          </w:tcPr>
+          <w:p>
+            <w:r>
+              <w:t xml:space="preserve">{#rows}{visual_damage}</w:t>
+            </w:r>
+          </w:p>
+        </w:tc>
+        <w:tc>
+          <w:tcPr>
+            <w:tcW w:w="1376" w:type="dxa"/>
+          </w:tcPr>
+          <w:p>
+            <w:r>
+              <w:t xml:space="preserve">{visual_damage_note}</w:t>
+            </w:r>
+          </w:p>
+        </w:tc>
+        <w:tc>
+          <w:tcPr>
+            <w:tcW w:w="1376" w:type="dxa"/>
+          </w:tcPr>
+          <w:p>
+            <w:r>
+              <w:t xml:space="preserve">{debris_present}</w:t>
+            </w:r>
+          </w:p>
+        </w:tc>
+        <w:tc>
+          <w:tcPr>
+            <w:tcW w:w="1376" w:type="dxa"/>
+          </w:tcPr>
+          <w:p>
+            <w:r>
+              <w:t xml:space="preserve">{debris_note}</w:t>
+            </w:r>
+          </w:p>
+        </w:tc>
+        <w:tc>
+          <w:tcPr>
+            <w:tcW w:w="1376" w:type="dxa"/>
+          </w:tcPr>
+          <w:p>
+            <w:r>
+              <w:t xml:space="preserve">{grating_present}</w:t>
+            </w:r>
+          </w:p>
+        </w:tc>
+        <w:tc>
+          <w:tcPr>
+            <w:tcW w:w="1376" w:type="dxa"/>
+          </w:tcPr>
+          <w:p>
+            <w:r>
+              <w:t xml:space="preserve">{grating_blockage}</w:t>
+            </w:r>
+          </w:p>
+        </w:tc>
+        <w:tc>
+          <w:tcPr>
+            <w:tcW w:w="1376" w:type="dxa"/>
+          </w:tcPr>
+          <w:p>
+            <w:r>
+              <w:t xml:space="preserve">{grating_note}{/rows}</w:t>
+            </w:r>
+          </w:p>
+        </w:tc>
+      </w:tr>
+    </w:tbl>
+    <w:tbl>
+      <w:tblPr>
+        <w:tblW w:w="9638" w:type="dxa"/>
+        <w:tblBorders>
+          <w:top w:val="single" w:sz="4" w:space="0" w:color="808080"/>
+          <w:left w:val="single" w:sz="4" w:space="0" w:color="808080"/>
+          <w:bottom w:val="single" w:sz="4" w:space="0" w:color="808080"/>
+          <w:right w:val="single" w:sz="4" w:space="0" w:color="808080"/>
+          <w:insideH w:val="single" w:sz="4" w:space="0" w:color="808080"/>
+          <w:insideV w:val="single" w:sz="4" w:space="0" w:color="808080"/>
+        </w:tblBorders>
+        <w:tblLayout w:type="fixed"/>
+      </w:tblPr>
+      <w:tblGrid>
+        <w:gridCol w:w="1927"/>
+        <w:gridCol w:w="1927"/>
+        <w:gridCol w:w="1927"/>
+        <w:gridCol w:w="1927"/>
+        <w:gridCol w:w="1927"/>
+      </w:tblGrid>
+      <w:tr>
+        <w:trPr>
+          <w:tblHeader/>
+        </w:trPr>
+        <w:tc>
+          <w:tcPr>
+            <w:tcW w:w="1927" w:type="dxa"/>
+          </w:tcPr>
+          <w:p>
+            <w:r>
+              <w:rPr>
+                <w:b/>
+              </w:rPr>
+              <w:t xml:space="preserve">Associated Pipes</w:t>
+            </w:r>
+          </w:p>
+        </w:tc>
+        <w:tc>
+          <w:tcPr>
+            <w:tcW w:w="1927" w:type="dxa"/>
+          </w:tcPr>
+          <w:p>
+            <w:r>
+              <w:rPr>
+                <w:b/>
+              </w:rPr>
+              <w:t xml:space="preserve">Pipes Note</w:t>
+            </w:r>
+          </w:p>
+        </w:tc>
+        <w:tc>
+          <w:tcPr>
+            <w:tcW w:w="1927" w:type="dxa"/>
+          </w:tcPr>
+          <w:p>
+            <w:r>
+              <w:rPr>
+                <w:b/>
+              </w:rPr>
+              <w:t xml:space="preserve">CP Readings</w:t>
+            </w:r>
+          </w:p>
+        </w:tc>
+        <w:tc>
+          <w:tcPr>
+            <w:tcW w:w="1927" w:type="dxa"/>
+          </w:tcPr>
+          <w:p>
+            <w:r>
+              <w:rPr>
+                <w:b/>
+              </w:rPr>
+              <w:t xml:space="preserve">Remarks</w:t>
+            </w:r>
+          </w:p>
+        </w:tc>
+        <w:tc>
+          <w:tcPr>
+            <w:tcW w:w="1927" w:type="dxa"/>
+          </w:tcPr>
+          <w:p>
+            <w:r>
+              <w:rPr>
+                <w:b/>
+              </w:rPr>
+              <w:t xml:space="preserve">Recorded</w:t>
+            </w:r>
+          </w:p>
+        </w:tc>
+      </w:tr>
+      <w:tr>
+        <w:tc>
+          <w:tcPr>
+            <w:tcW w:w="1927" w:type="dxa"/>
+          </w:tcPr>
+          <w:p>
+            <w:r>
+              <w:t xml:space="preserve">{#rows}{associated_pipes}</w:t>
+            </w:r>
+          </w:p>
+        </w:tc>
+        <w:tc>
+          <w:tcPr>
+            <w:tcW w:w="1927" w:type="dxa"/>
+          </w:tcPr>
+          <w:p>
+            <w:r>
+              <w:t xml:space="preserve">{associated_pipes_note}</w:t>
+            </w:r>
+          </w:p>
+        </w:tc>
+        <w:tc>
+          <w:tcPr>
+            <w:tcW w:w="1927" w:type="dxa"/>
+          </w:tcPr>
+          <w:p>
+            <w:r>
+              <w:t xml:space="preserve">{cp_readings}</w:t>
+            </w:r>
+          </w:p>
+        </w:tc>
+        <w:tc>
+          <w:tcPr>
+            <w:tcW w:w="1927" w:type="dxa"/>
+          </w:tcPr>
+          <w:p>
+            <w:r>
+              <w:t xml:space="preserve">{remarks}</w:t>
+            </w:r>
+          </w:p>
+        </w:tc>
+        <w:tc>
+          <w:tcPr>
+            <w:tcW w:w="1927" w:type="dxa"/>
+          </w:tcPr>
+          <w:p>
+            <w:r>
+              <w:t xml:space="preserve">{recorded}{/rows}</w:t>
+            </w:r>
+          </w:p>
+        </w:tc>
+      </w:tr>
+    </w:tbl>
+    <w:p>
+      <w:r>
+        <w:t xml:space="preserve">{/isCAISSON}</w:t>
+      </w:r>
+    </w:p>
+    <w:p>
+      <w:r>
+        <w:t xml:space="preserve">{#isSEABED}</w:t>
+      </w:r>
+    </w:p>
+    <w:p>
+      <w:r>
+        <w:rPr>
+          <w:b/>
+          <w:sz w:val="26"/>
+          <w:szCs w:val="26"/>
+        </w:rPr>
+        <w:t xml:space="preserve">SEABED Results</w:t>
+      </w:r>
+    </w:p>
+    <w:tbl>
+      <w:tblPr>
+        <w:tblW w:w="9638" w:type="dxa"/>
+        <w:tblBorders>
+          <w:top w:val="single" w:sz="4" w:space="0" w:color="808080"/>
+          <w:left w:val="single" w:sz="4" w:space="0" w:color="808080"/>
+          <w:bottom w:val="single" w:sz="4" w:space="0" w:color="808080"/>
+          <w:right w:val="single" w:sz="4" w:space="0" w:color="808080"/>
+          <w:insideH w:val="single" w:sz="4" w:space="0" w:color="808080"/>
+          <w:insideV w:val="single" w:sz="4" w:space="0" w:color="808080"/>
+        </w:tblBorders>
+        <w:tblLayout w:type="fixed"/>
+      </w:tblPr>
+      <w:tblGrid>
+        <w:gridCol w:w="1606"/>
+        <w:gridCol w:w="1606"/>
+        <w:gridCol w:w="1606"/>
+        <w:gridCol w:w="1606"/>
+        <w:gridCol w:w="1606"/>
+        <w:gridCol w:w="1606"/>
+      </w:tblGrid>
+      <w:tr>
+        <w:trPr>
+          <w:tblHeader/>
+        </w:trPr>
+        <w:tc>
+          <w:tcPr>
+            <w:tcW w:w="1606" w:type="dxa"/>
+          </w:tcPr>
+          <w:p>
+            <w:r>
+              <w:rPr>
+                <w:b/>
+              </w:rPr>
+              <w:t xml:space="preserve">Range (m)</w:t>
+            </w:r>
+          </w:p>
+        </w:tc>
+        <w:tc>
+          <w:tcPr>
+            <w:tcW w:w="1606" w:type="dxa"/>
+          </w:tcPr>
+          <w:p>
+            <w:r>
+              <w:rPr>
+                <w:b/>
+              </w:rPr>
+              <w:t xml:space="preserve">Fixes</w:t>
+            </w:r>
+          </w:p>
+        </w:tc>
+        <w:tc>
+          <w:tcPr>
+            <w:tcW w:w="1606" w:type="dxa"/>
+          </w:tcPr>
+          <w:p>
+            <w:r>
+              <w:rPr>
+                <w:b/>
+              </w:rPr>
+              <w:t xml:space="preserve">Debris</w:t>
+            </w:r>
+          </w:p>
+        </w:tc>
+        <w:tc>
+          <w:tcPr>
+            <w:tcW w:w="1606" w:type="dxa"/>
+          </w:tcPr>
+          <w:p>
+            <w:r>
+              <w:rPr>
+                <w:b/>
+              </w:rPr>
+              <w:t xml:space="preserve">Debris Type</w:t>
+            </w:r>
+          </w:p>
+        </w:tc>
+        <w:tc>
+          <w:tcPr>
+            <w:tcW w:w="1606" w:type="dxa"/>
+          </w:tcPr>
+          <w:p>
+            <w:r>
+              <w:rPr>
+                <w:b/>
+              </w:rPr>
+              <w:t xml:space="preserve">Remarks</w:t>
+            </w:r>
+          </w:p>
+        </w:tc>
+        <w:tc>
+          <w:tcPr>
+            <w:tcW w:w="1606" w:type="dxa"/>
+          </w:tcPr>
+          <w:p>
+            <w:r>
+              <w:rPr>
+                <w:b/>
+              </w:rPr>
+              <w:t xml:space="preserve">Recorded</w:t>
+            </w:r>
+          </w:p>
+        </w:tc>
+      </w:tr>
+      <w:tr>
+        <w:tc>
+          <w:tcPr>
+            <w:tcW w:w="1606" w:type="dxa"/>
+          </w:tcPr>
+          <w:p>
+            <w:r>
+              <w:t xml:space="preserve">{#rows}{range_meters}</w:t>
+            </w:r>
+          </w:p>
+        </w:tc>
+        <w:tc>
+          <w:tcPr>
+            <w:tcW w:w="1606" w:type="dxa"/>
+          </w:tcPr>
+          <w:p>
+            <w:r>
+              <w:t xml:space="preserve">{fixes}</w:t>
+            </w:r>
+          </w:p>
+        </w:tc>
+        <w:tc>
+          <w:tcPr>
+            <w:tcW w:w="1606" w:type="dxa"/>
+          </w:tcPr>
+          <w:p>
+            <w:r>
+              <w:t xml:space="preserve">{debris}</w:t>
+            </w:r>
+          </w:p>
+        </w:tc>
+        <w:tc>
+          <w:tcPr>
+            <w:tcW w:w="1606" w:type="dxa"/>
+          </w:tcPr>
+          <w:p>
+            <w:r>
+              <w:t xml:space="preserve">{debris_type}</w:t>
+            </w:r>
+          </w:p>
+        </w:tc>
+        <w:tc>
+          <w:tcPr>
+            <w:tcW w:w="1606" w:type="dxa"/>
+          </w:tcPr>
+          <w:p>
+            <w:r>
+              <w:t xml:space="preserve">{remarks}</w:t>
+            </w:r>
+          </w:p>
+        </w:tc>
+        <w:tc>
+          <w:tcPr>
+            <w:tcW w:w="1606" w:type="dxa"/>
+          </w:tcPr>
+          <w:p>
+            <w:r>
+              <w:t xml:space="preserve">{recorded}{/rows}</w:t>
+            </w:r>
+          </w:p>
+        </w:tc>
+      </w:tr>
+    </w:tbl>
+    <w:p>
+      <w:r>
+        <w:t xml:space="preserve">{/isSEABED}</w:t>
+      </w:r>
+    </w:p>
+    <w:p>
+      <w:r>
+        <w:t xml:space="preserve">{#isPIPELINE}</w:t>
+      </w:r>
+    </w:p>
+    <w:p>
+      <w:r>
+        <w:rPr>
+          <w:b/>
+          <w:sz w:val="26"/>
+          <w:szCs w:val="26"/>
+        </w:rPr>
+        <w:t xml:space="preserve">PIPELINE Results</w:t>
+      </w:r>
+    </w:p>
+    <w:tbl>
+      <w:tblPr>
+        <w:tblW w:w="9638" w:type="dxa"/>
+        <w:tblBorders>
+          <w:top w:val="single" w:sz="4" w:space="0" w:color="808080"/>
+          <w:left w:val="single" w:sz="4" w:space="0" w:color="808080"/>
+          <w:bottom w:val="single" w:sz="4" w:space="0" w:color="808080"/>
+          <w:right w:val="single" w:sz="4" w:space="0" w:color="808080"/>
+          <w:insideH w:val="single" w:sz="4" w:space="0" w:color="808080"/>
+          <w:insideV w:val="single" w:sz="4" w:space="0" w:color="808080"/>
+        </w:tblBorders>
+        <w:tblLayout w:type="fixed"/>
+      </w:tblPr>
+      <w:tblGrid>
+        <w:gridCol w:w="1204"/>
+        <w:gridCol w:w="1204"/>
+        <w:gridCol w:w="1204"/>
+        <w:gridCol w:w="1204"/>
+        <w:gridCol w:w="1204"/>
+        <w:gridCol w:w="1204"/>
+        <w:gridCol w:w="1204"/>
+        <w:gridCol w:w="1204"/>
+      </w:tblGrid>
+      <w:tr>
+        <w:trPr>
+          <w:tblHeader/>
+        </w:trPr>
+        <w:tc>
+          <w:tcPr>
+            <w:tcW w:w="1204" w:type="dxa"/>
+          </w:tcPr>
+          <w:p>
+            <w:r>
+              <w:rPr>
+                <w:b/>
+              </w:rPr>
+              <w:t xml:space="preserve">Location</w:t>
+            </w:r>
+          </w:p>
+        </w:tc>
+        <w:tc>
+          <w:tcPr>
+            <w:tcW w:w="1204" w:type="dxa"/>
+          </w:tcPr>
+          <w:p>
+            <w:r>
+              <w:rPr>
+                <w:b/>
+              </w:rPr>
+              <w:t xml:space="preserve">Depth/El</w:t>
+            </w:r>
+          </w:p>
+        </w:tc>
+        <w:tc>
+          <w:tcPr>
+            <w:tcW w:w="1204" w:type="dxa"/>
+          </w:tcPr>
+          <w:p>
+            <w:r>
+              <w:rPr>
+                <w:b/>
+              </w:rPr>
+              <w:t xml:space="preserve">Orientation</w:t>
+            </w:r>
+          </w:p>
+        </w:tc>
+        <w:tc>
+          <w:tcPr>
+            <w:tcW w:w="1204" w:type="dxa"/>
+          </w:tcPr>
+          <w:p>
+            <w:r>
+              <w:rPr>
+                <w:b/>
+              </w:rPr>
+              <w:t xml:space="preserve">Category</w:t>
+            </w:r>
+          </w:p>
+        </w:tc>
+        <w:tc>
+          <w:tcPr>
+            <w:tcW w:w="1204" w:type="dxa"/>
+          </w:tcPr>
+          <w:p>
+            <w:r>
+              <w:rPr>
+                <w:b/>
+              </w:rPr>
+              <w:t xml:space="preserve">Damage Type</w:t>
+            </w:r>
+          </w:p>
+        </w:tc>
+        <w:tc>
+          <w:tcPr>
+            <w:tcW w:w="1204" w:type="dxa"/>
+          </w:tcPr>
+          <w:p>
+            <w:r>
+              <w:rPr>
+                <w:b/>
+              </w:rPr>
+              <w:t xml:space="preserve">Debris Type</w:t>
+            </w:r>
+          </w:p>
+        </w:tc>
+        <w:tc>
+          <w:tcPr>
+            <w:tcW w:w="1204" w:type="dxa"/>
+          </w:tcPr>
+          <w:p>
+            <w:r>
+              <w:rPr>
+                <w:b/>
+              </w:rPr>
+              <w:t xml:space="preserve">Remarks</w:t>
+            </w:r>
+          </w:p>
+        </w:tc>
+        <w:tc>
+          <w:tcPr>
+            <w:tcW w:w="1204" w:type="dxa"/>
+          </w:tcPr>
+          <w:p>
+            <w:r>
+              <w:rPr>
+                <w:b/>
+              </w:rPr>
+              <w:t xml:space="preserve">Recorded</w:t>
+            </w:r>
+          </w:p>
+        </w:tc>
+      </w:tr>
+      <w:tr>
+        <w:tc>
+          <w:tcPr>
+            <w:tcW w:w="1204" w:type="dxa"/>
+          </w:tcPr>
+          <w:p>
+            <w:r>
+              <w:t xml:space="preserve">{#rows}{location}</w:t>
+            </w:r>
+          </w:p>
+        </w:tc>
+        <w:tc>
+          <w:tcPr>
+            <w:tcW w:w="1204" w:type="dxa"/>
+          </w:tcPr>
+          <w:p>
+            <w:r>
+              <w:t xml:space="preserve">{depth_el}</w:t>
+            </w:r>
+          </w:p>
+        </w:tc>
+        <w:tc>
+          <w:tcPr>
+            <w:tcW w:w="1204" w:type="dxa"/>
+          </w:tcPr>
+          <w:p>
+            <w:r>
+              <w:t xml:space="preserve">{orientation}</w:t>
+            </w:r>
+          </w:p>
+        </w:tc>
+        <w:tc>
+          <w:tcPr>
+            <w:tcW w:w="1204" w:type="dxa"/>
+          </w:tcPr>
+          <w:p>
+            <w:r>
+              <w:t xml:space="preserve">{pipeline_category}</w:t>
+            </w:r>
+          </w:p>
+        </w:tc>
+        <w:tc>
+          <w:tcPr>
+            <w:tcW w:w="1204" w:type="dxa"/>
+          </w:tcPr>
+          <w:p>
+            <w:r>
+              <w:t xml:space="preserve">{pipeline_damage}</w:t>
+            </w:r>
+          </w:p>
+        </w:tc>
+        <w:tc>
+          <w:tcPr>
+            <w:tcW w:w="1204" w:type="dxa"/>
+          </w:tcPr>
+          <w:p>
+            <w:r>
+              <w:t xml:space="preserve">{pipeline_debris}</w:t>
+            </w:r>
+          </w:p>
+        </w:tc>
+        <w:tc>
+          <w:tcPr>
+            <w:tcW w:w="1204" w:type="dxa"/>
+          </w:tcPr>
+          <w:p>
+            <w:r>
+              <w:t xml:space="preserve">{remarks}</w:t>
+            </w:r>
+          </w:p>
+        </w:tc>
+        <w:tc>
+          <w:tcPr>
+            <w:tcW w:w="1204" w:type="dxa"/>
+          </w:tcPr>
+          <w:p>
+            <w:r>
+              <w:t xml:space="preserve">{recorded}{/rows}</w:t>
+            </w:r>
+          </w:p>
+        </w:tc>
+      </w:tr>
+    </w:tbl>
+    <w:p>
+      <w:r>
+        <w:t xml:space="preserve">{/isPIPELINE}</w:t>
       </w:r>
     </w:p>
     <w:p>

</xml_diff>

<commit_message>
feat: embed a section picture and space out the tables
A section picture rendered as a blank frame, and two tables that touch
merged into one in Word.

- spike/create-template.ts: gate the picture tag behind {#has_image} and
  append an empty paragraph after every table
- src/db/services/report-data.service.ts: ship ordered picture candidates
  per section, evidence first then clip still, and drop NO_IMAGE
- src/features/reports/report-generator.ts: decode each candidate with
  Bun.Image, fit it to 480x360, encode PNG, size the drawing from the
  picture, and renumber the repeated drawing ids
- src/features/reports/default-template.docx: regenerated from the spike
- tests/db/report-data.service.test.ts: seed two clips and assert the
  candidate order
- tests/features/reports/report-generator.test.ts: the mixed-types case
  holds one drawing, from the seeded evidence object
</commit_message>
<xml_diff>
--- a/src/features/reports/default-template.docx
+++ b/src/features/reports/default-template.docx
@@ -200,9 +200,15 @@
         </w:tc>
       </w:tr>
     </w:tbl>
+    <w:p/>
     <w:p>
       <w:r>
         <w:t xml:space="preserve">{#sections}</w:t>
+      </w:r>
+    </w:p>
+    <w:p>
+      <w:r>
+        <w:t xml:space="preserve">{#has_image}</w:t>
       </w:r>
     </w:p>
     <w:p>
@@ -211,6 +217,11 @@
       </w:pPr>
       <w:r>
         <w:t xml:space="preserve">{%image}</w:t>
+      </w:r>
+    </w:p>
+    <w:p>
+      <w:r>
+        <w:t xml:space="preserve">{/has_image}</w:t>
       </w:r>
     </w:p>
     <w:p>
@@ -419,6 +430,7 @@
         </w:tc>
       </w:tr>
     </w:tbl>
+    <w:p/>
     <w:p>
       <w:r>
         <w:t xml:space="preserve">{/isGVI}</w:t>
@@ -606,6 +618,7 @@
         </w:tc>
       </w:tr>
     </w:tbl>
+    <w:p/>
     <w:p>
       <w:r>
         <w:t xml:space="preserve">{/isCVI}</w:t>
@@ -793,6 +806,7 @@
         </w:tc>
       </w:tr>
     </w:tbl>
+    <w:p/>
     <w:p>
       <w:r>
         <w:t xml:space="preserve">{/isDVI}</w:t>
@@ -1004,6 +1018,7 @@
         </w:tc>
       </w:tr>
     </w:tbl>
+    <w:p/>
     <w:p>
       <w:r>
         <w:t xml:space="preserve">{/isMGI}</w:t>
@@ -1287,6 +1302,7 @@
         </w:tc>
       </w:tr>
     </w:tbl>
+    <w:p/>
     <w:p>
       <w:r>
         <w:t xml:space="preserve">{/isCP}</w:t>
@@ -1498,6 +1514,7 @@
         </w:tc>
       </w:tr>
     </w:tbl>
+    <w:p/>
     <w:p>
       <w:r>
         <w:t xml:space="preserve">{/isFMD}</w:t>
@@ -1709,6 +1726,7 @@
         </w:tc>
       </w:tr>
     </w:tbl>
+    <w:p/>
     <w:p>
       <w:r>
         <w:t xml:space="preserve">{/isSCOUR}</w:t>
@@ -1944,6 +1962,7 @@
         </w:tc>
       </w:tr>
     </w:tbl>
+    <w:p/>
     <w:tbl>
       <w:tblPr>
         <w:tblW w:w="9638" w:type="dxa"/>
@@ -2087,6 +2106,7 @@
         </w:tc>
       </w:tr>
     </w:tbl>
+    <w:p/>
     <w:tbl>
       <w:tblPr>
         <w:tblW w:w="9638" w:type="dxa"/>
@@ -2230,6 +2250,7 @@
         </w:tc>
       </w:tr>
     </w:tbl>
+    <w:p/>
     <w:tbl>
       <w:tblPr>
         <w:tblW w:w="9638" w:type="dxa"/>
@@ -2397,6 +2418,7 @@
         </w:tc>
       </w:tr>
     </w:tbl>
+    <w:p/>
     <w:p>
       <w:r>
         <w:t xml:space="preserve">{/isBSI}</w:t>
@@ -2584,6 +2606,7 @@
         </w:tc>
       </w:tr>
     </w:tbl>
+    <w:p/>
     <w:p>
       <w:r>
         <w:t xml:space="preserve">{/isCGB}</w:t>
@@ -2747,6 +2770,7 @@
         </w:tc>
       </w:tr>
     </w:tbl>
+    <w:p/>
     <w:tbl>
       <w:tblPr>
         <w:tblW w:w="9638" w:type="dxa"/>
@@ -2962,6 +2986,7 @@
         </w:tc>
       </w:tr>
     </w:tbl>
+    <w:p/>
     <w:p>
       <w:r>
         <w:t xml:space="preserve">{/isRISER}</w:t>
@@ -3173,6 +3198,7 @@
         </w:tc>
       </w:tr>
     </w:tbl>
+    <w:p/>
     <w:tbl>
       <w:tblPr>
         <w:tblW w:w="9638" w:type="dxa"/>
@@ -3316,6 +3342,7 @@
         </w:tc>
       </w:tr>
     </w:tbl>
+    <w:p/>
     <w:p>
       <w:r>
         <w:t xml:space="preserve">{/isCAISSON}</w:t>
@@ -3503,6 +3530,7 @@
         </w:tc>
       </w:tr>
     </w:tbl>
+    <w:p/>
     <w:p>
       <w:r>
         <w:t xml:space="preserve">{/isSEABED}</w:t>
@@ -3738,6 +3766,7 @@
         </w:tc>
       </w:tr>
     </w:tbl>
+    <w:p/>
     <w:p>
       <w:r>
         <w:t xml:space="preserve">{/isPIPELINE}</w:t>

</xml_diff>